<commit_message>
demographics-and-growth: frozen 18-economy re-estimation, real correlation chart, drill-down 2 closed (S15)
</commit_message>
<xml_diff>
--- a/notes/demographics-and-growth/index.docx
+++ b/notes/demographics-and-growth/index.docx
@@ -15,7 +15,7 @@
         <w:pStyle w:val="Subtitle"/>
       </w:pPr>
       <w:r>
-        <w:t xml:space="preserve">Population structure matters for growth, but social fabric decides how much of it is realised</w:t>
+        <w:t xml:space="preserve">What eighteen economies’ long-run projections do, and do not, say about the demographic dividend</w:t>
       </w:r>
     </w:p>
     <w:p>
@@ -130,7 +130,7 @@
               <w:t xml:space="preserve"> </w:t>
             </w:r>
             <w:r>
-              <w:t xml:space="preserve">Working-age population growth and inequality line up with projected growth in the expected directions, yet several economies sit far from the pattern, which points to social fabric and productivity as the swing factors.</w:t>
+              <w:t xml:space="preserve">Re-estimated on one frozen dataset, working-age growth (+0.25) and inequality (−0.22) point the expected way but cannot be told apart from zero in 18 economies. Only urbanisation has a link whose 95% interval excludes zero, and it is negative, a level effect. A demographic and a social factor each line up with growth, in opposite directions, and cancel in an equal-weight composite.</w:t>
             </w:r>
           </w:p>
           <w:p>
@@ -152,7 +152,7 @@
               <w:t xml:space="preserve"> </w:t>
             </w:r>
             <w:r>
-              <w:t xml:space="preserve">It turns the</w:t>
+              <w:t xml:space="preserve">It tests the</w:t>
             </w:r>
             <w:r>
               <w:t xml:space="preserve"> </w:t>
@@ -164,7 +164,7 @@
               <w:t xml:space="preserve"> </w:t>
             </w:r>
             <w:r>
-              <w:t xml:space="preserve">slogan into a screen that separates economies with a dividend from those able to cash it.</w:t>
+              <w:t xml:space="preserve">story against the projections themselves, and shows how two early correlations that looked strong did not survive a frozen re-run.</w:t>
             </w:r>
           </w:p>
         </w:tc>
@@ -304,13 +304,13 @@
           <w:b/>
           <w:bCs/>
         </w:rPr>
-        <w:t xml:space="preserve">Demography lines up with growth, modestly.</w:t>
+        <w:t xml:space="preserve">Demography lines up with growth, weakly.</w:t>
       </w:r>
       <w:r>
         <w:t xml:space="preserve"> </w:t>
       </w:r>
       <w:r>
-        <w:t xml:space="preserve">Across the sample, growth of the economically active population and projected potential growth moved together, with a correlation of about 0.56 in one run of the data. Population growth and active-population growth were close to the same thing, as expected, with a correlation near 0.9. The simulated figure below shows what such a relationship looks like for 18 economies: an upward slope with a lot of scatter around it.</w:t>
+        <w:t xml:space="preserve">On the frozen table of 18 economies, growth of the economically active population and projected potential growth have a correlation of +0.25, with a 95% interval from −0.25 to +0.64. The sign is the one the dividend story predicts, but 18 observations cannot separate it from zero. A spring 2025 summary reported 0.56 for the same pair. It also reported that total and active population growth correlate at 0.90. In the final table the two series differ by exactly 0.2 percentage points in every economy, so one was built from the other and the correlation carries no information.</w:t>
       </w:r>
     </w:p>
     <w:tbl>
@@ -335,7 +335,7 @@
             <w:r>
               <w:drawing>
                 <wp:inline>
-                  <wp:extent cx="5334000" cy="3306826"/>
+                  <wp:extent cx="5334000" cy="2800033"/>
                   <wp:effectExtent b="0" l="0" r="0" t="0"/>
                   <wp:docPr descr="" title="" id="12" name="Picture"/>
                   <a:graphic>
@@ -356,7 +356,7 @@
                         <pic:spPr bwMode="auto">
                           <a:xfrm>
                             <a:off x="0" y="0"/>
-                            <a:ext cx="5334000" cy="3306826"/>
+                            <a:ext cx="5334000" cy="2800033"/>
                           </a:xfrm>
                           <a:prstGeom prst="rect">
                             <a:avLst/>
@@ -385,7 +385,7 @@
               <w:pStyle w:val="ImageCaption"/>
             </w:pPr>
             <w:r>
-              <w:t xml:space="preserve">Figure 1: Growth of the economically active population against projected potential growth, 18 economies, shaded by inequality tercile (simulated data).</w:t>
+              <w:t xml:space="preserve">Figure 1: Correlation of each indicator with projected potential growth, 18 emerging economies, 2024-2044. Filled dots: frozen final table, with 95% intervals. Hollow dots: values in the spring 2025 summary. Source: the project’s final 18-economy table (published population projections, long-run growth scenarios and development indicators); the author’s calculations.</w:t>
             </w:r>
           </w:p>
           <w:bookmarkEnd w:id="14"/>
@@ -401,13 +401,13 @@
           <w:b/>
           <w:bCs/>
         </w:rPr>
-        <w:t xml:space="preserve">Inequality travels with weaker growth.</w:t>
+        <w:t xml:space="preserve">Inequality: the sign survives, the strength does not.</w:t>
       </w:r>
       <w:r>
         <w:t xml:space="preserve"> </w:t>
       </w:r>
       <w:r>
-        <w:t xml:space="preserve">Higher income inequality was associated with lower projected growth, and the inequality-growth association was the strongest of the social indicators in one run (a correlation of about −0.74). Literacy and urbanisation correlated negatively with projected growth in the sample, which looks perverse until one notices who is in it: economies that are already highly urbanised and literate are the mature ones, with lower growth ceilings. These are level effects, not evidence that schooling hurts. The note says so plainly, because a naive reading would recommend the opposite of what the development literature shows.</w:t>
+        <w:t xml:space="preserve">The spring summary put the inequality-growth correlation at about −0.74, the strongest of the social links. The frozen table gives −0.22, with an interval from −0.62 to +0.27, and the rank correlation is only −0.08. The earlier figure most likely came from a wider early sample that included several Gulf economies and Egypt, which the final table does not contain. The one link whose interval excludes zero is urbanisation, at −0.56 (−0.81 to −0.13), with literacy at −0.37 close behind. These negative signs look perverse until one notices who is in the sample: economies that are already highly urbanised and literate are the mature ones, with lower growth ceilings. These are level effects, not evidence that schooling or cities hurt growth. The note says so plainly, because a naive reading would recommend the opposite of what the development literature shows. Adding the United States to the sample moves none of the four correlations by more than 0.03.</w:t>
       </w:r>
     </w:p>
     <w:p>
@@ -431,7 +431,7 @@
         </w:numPr>
       </w:pPr>
       <w:r>
-        <w:t xml:space="preserve">India combines a growing workforce, with its working-age population peaking around 2032, with the highest projected potential growth of the group, about 6.2% a year, despite the weakest social scorecard on literacy and urbanisation. Its case rests on scale and on the scope for upward mobility if policy delivers.</w:t>
+        <w:t xml:space="preserve">India combines a growing workforce, with its working-age population peaking around 2032, with the highest projected potential growth of the group, despite the weakest social scorecard on literacy and urbanisation. Its case rests on scale and on the scope for upward mobility if policy delivers.</w:t>
       </w:r>
     </w:p>
     <w:p>
@@ -443,7 +443,7 @@
         </w:numPr>
       </w:pPr>
       <w:r>
-        <w:t xml:space="preserve">South Africa has a similarly favourable demographic profile but a projected potential growth of only about 1.0% a year. Inequality and weak human capital are the standard explanation, and it is the clearest example of a dividend that goes uncollected.</w:t>
+        <w:t xml:space="preserve">South Africa has a similarly favourable demographic profile but the lowest projected potential growth of the group. Inequality and weak human capital are the standard explanation, and it is the clearest example of a dividend that goes uncollected.</w:t>
       </w:r>
     </w:p>
     <w:p>
@@ -473,7 +473,7 @@
         <w:t xml:space="preserve"> </w:t>
       </w:r>
       <w:r>
-        <w:t xml:space="preserve">Plotting the demographic factor against the social fabric factor sorts the economies into four groups: strong on both, strong demography with weak social fabric, the reverse, and weak on both. Each factor, alone, accounted for about 0.37 and 0.38 of the variation (R-squared) in projected growth, and the composite did better than either. The factors themselves summarise their blocks unevenly: the first demographic component captured about 63.0% of the variance of its six variables, the social component about 44.5% of its twelve.</w:t>
+        <w:t xml:space="preserve">Plotting the demographic factor against the social fabric factor sorts the economies into four groups: strong on both, strong demography with weak social fabric, the reverse, and weak on both. The factors summarise their blocks unevenly: the first demographic component captures 0.63 of the variance of its six variables, the social component 0.44 of its twelve. On the frozen table the demographic factor correlates at +0.64 with projected growth (R-squared 0.40), but its loadings are dominated by population size, so it mostly says that India and China are both large and fast-growing. The social factor correlates at −0.52 (R-squared 0.27): the mature, well-served economies are projected to grow more slowly, which is convergence rather than a social drag. Because the two point in opposite directions, the equal-weight composite explains almost nothing (R-squared 0.001). An earlier run reported R-squared values of about 0.37 and 0.38, both positive, and a composite that did better than either; that run used projected growth per head, a measure the final table does not hold, so it cannot be reproduced.</w:t>
       </w:r>
     </w:p>
     <w:tbl>
@@ -675,13 +675,13 @@
           <w:b/>
           <w:bCs/>
         </w:rPr>
-        <w:t xml:space="preserve">Demography sets the ceiling; social fabric sets how much of it is reached.</w:t>
+        <w:t xml:space="preserve">Eighteen economies cannot confirm a dividend.</w:t>
       </w:r>
       <w:r>
         <w:t xml:space="preserve"> </w:t>
       </w:r>
       <w:r>
-        <w:t xml:space="preserve">The same working-age growth appears alongside very different projected growth, and inequality and human capital are the most natural candidates for the gap.</w:t>
+        <w:t xml:space="preserve">Working-age growth and inequality carry the expected signs, but neither interval excludes zero. The same working-age growth appears alongside very different projected growth, and India and South Africa sit at opposite ends of the group with similar demographic profiles.</w:t>
       </w:r>
     </w:p>
     <w:p>
@@ -697,13 +697,13 @@
           <w:b/>
           <w:bCs/>
         </w:rPr>
-        <w:t xml:space="preserve">Productivity can offset shrinking numbers.</w:t>
+        <w:t xml:space="preserve">A composite can hide two signals.</w:t>
       </w:r>
       <w:r>
         <w:t xml:space="preserve"> </w:t>
       </w:r>
       <w:r>
-        <w:t xml:space="preserve">The high-literacy, low-inequality economies with falling workforces still show respectable projected growth, which says that the weight falls on output per worker.</w:t>
+        <w:t xml:space="preserve">The demographic and social factors each line up with projected growth, in opposite directions, and an equal-weight average cancels them. Look at the components before trusting an index.</w:t>
       </w:r>
     </w:p>
     <w:p>
@@ -719,13 +719,13 @@
           <w:b/>
           <w:bCs/>
         </w:rPr>
-        <w:t xml:space="preserve">Timing beats averages.</w:t>
+        <w:t xml:space="preserve">Productivity can offset shrinking numbers.</w:t>
       </w:r>
       <w:r>
         <w:t xml:space="preserve"> </w:t>
       </w:r>
       <w:r>
-        <w:t xml:space="preserve">The year a workforce peaks and the year the dependency ratio crosses one half say more about the investment horizon than a twenty-year average growth rate.</w:t>
+        <w:t xml:space="preserve">The high-literacy, low-inequality economies with falling workforces still show respectable projected growth, which says that the weight falls on output per worker.</w:t>
       </w:r>
     </w:p>
     <w:p>
@@ -741,13 +741,13 @@
           <w:b/>
           <w:bCs/>
         </w:rPr>
-        <w:t xml:space="preserve">Level effects mislead.</w:t>
+        <w:t xml:space="preserve">Timing beats averages.</w:t>
       </w:r>
       <w:r>
         <w:t xml:space="preserve"> </w:t>
       </w:r>
       <w:r>
-        <w:t xml:space="preserve">Negative correlations for literacy and urbanisation reflect mature economies with lower growth ceilings, not a harm from education.</w:t>
+        <w:t xml:space="preserve">The year a workforce peaks and the year the dependency ratio crosses one half say more about the investment horizon than a twenty-year average growth rate.</w:t>
       </w:r>
     </w:p>
     <w:p>
@@ -763,6 +763,28 @@
           <w:b/>
           <w:bCs/>
         </w:rPr>
+        <w:t xml:space="preserve">Level effects mislead.</w:t>
+      </w:r>
+      <w:r>
+        <w:t xml:space="preserve"> </w:t>
+      </w:r>
+      <w:r>
+        <w:t xml:space="preserve">Negative correlations for literacy and urbanisation reflect mature economies with lower growth ceilings, not a harm from education.</w:t>
+      </w:r>
+    </w:p>
+    <w:p>
+      <w:pPr>
+        <w:pStyle w:val="Compact"/>
+        <w:numPr>
+          <w:ilvl w:val="0"/>
+          <w:numId w:val="1003"/>
+        </w:numPr>
+      </w:pPr>
+      <w:r>
+        <w:rPr>
+          <w:b/>
+          <w:bCs/>
+        </w:rPr>
         <w:t xml:space="preserve">Disagreement among scenarios is information.</w:t>
       </w:r>
       <w:r>
@@ -795,7 +817,7 @@
         <w:pStyle w:val="BodyText"/>
       </w:pPr>
       <w:r>
-        <w:t xml:space="preserve">The demographic factor, as constructed, was dominated by population size rather than by the speed or shape of change, which is not the dimension that the dividend argument cares about. A better version would build the factor from growth and timing variables only. Early summaries also reported different correlations for the same relationship, a reminder to freeze one dataset, regenerate every figure from it, and quote only that version. Next steps are to add dependency-ratio timing as an explicit regressor, to include a measure of productivity growth, and to test whether the inequality effect survives once the sample is widened beyond 18 economies.</w:t>
+        <w:t xml:space="preserve">The demographic factor, as constructed, was dominated by population size rather than by the speed or shape of change, which is not the dimension that the dividend argument cares about. A better version would build the factor from growth and timing variables only. Early summaries reported different correlations for the same relationships. Re-estimated on the frozen final table, two of the five headline values moved by more than 0.3 and one turned out to be built in by construction. That is why every value quoted here comes from that one table. Next steps are to add dependency-ratio timing as an explicit regressor, to include a measure of productivity growth, and to test whether the inequality effect survives once the sample is widened beyond 18 economies.</w:t>
       </w:r>
     </w:p>
     <w:p>
@@ -821,7 +843,7 @@
         <w:pStyle w:val="FirstParagraph"/>
       </w:pPr>
       <w:r>
-        <w:t xml:space="preserve">The note and presentation were produced in spring 2025, using published population projections, published long-run growth scenarios and public development indicators for 18 emerging economies. Statements of correlation and explained variance in the text are the project’s own results; the specific values are those reported in the working outputs. All charts on this page are simulated to share the structure of the analysis and are not the project’s results.</w:t>
+        <w:t xml:space="preserve">The note and presentation were produced in spring 2025, using published population projections, published long-run growth scenarios and public development indicators for 18 emerging economies. Correlations, intervals and explained variance in the text were re-estimated in October 2026 on the project’s frozen final table of 18 economies, with 95% intervals from the Fisher transformation. The spring 2025 values are quoted only where they differ. The correlation chart shows these derived statistics, not the underlying third-party projections. The quadrant chart and the dependency-ratio paths are simulated to share the structure of the analysis and are not the project’s results.</w:t>
       </w:r>
     </w:p>
     <w:p>

</xml_diff>